<commit_message>
Informe final taller 1
</commit_message>
<xml_diff>
--- a/Taller_Carpetas/Marcelo_Salcedo_Taller_1_Marcelo_Salcedo.docx
+++ b/Taller_Carpetas/Marcelo_Salcedo_Taller_1_Marcelo_Salcedo.docx
@@ -77,42 +77,62 @@
     </w:p>
     <w:p>
       <w:pPr>
+        <w:pStyle w:val="Default"/>
+      </w:pPr>
+      <w:r>
+        <w:rPr>
+          <w:b/>
+          <w:sz w:val="36"/>
+        </w:rPr>
+        <w:t xml:space="preserve"> </w:t>
+      </w:r>
+    </w:p>
+    <w:p>
+      <w:pPr>
+        <w:pStyle w:val="Default"/>
+        <w:rPr>
+          <w:color w:val="auto"/>
+        </w:rPr>
+      </w:pPr>
+    </w:p>
+    <w:p>
+      <w:pPr>
         <w:jc w:val="center"/>
         <w:rPr>
           <w:rFonts w:ascii="Arial" w:hAnsi="Arial" w:cs="Arial"/>
-          <w:sz w:val="44"/>
+          <w:sz w:val="36"/>
           <w:szCs w:val="34"/>
           <w:lang w:val="es-ES"/>
         </w:rPr>
       </w:pPr>
       <w:r>
         <w:rPr>
-          <w:rFonts w:ascii="Arial" w:hAnsi="Arial" w:cs="Arial"/>
-          <w:b/>
-          <w:sz w:val="36"/>
-          <w:szCs w:val="24"/>
-          <w:lang w:val="es-ES"/>
+          <w:sz w:val="20"/>
         </w:rPr>
         <w:t xml:space="preserve"> </w:t>
       </w:r>
       <w:r>
         <w:rPr>
-          <w:rFonts w:ascii="Arial" w:hAnsi="Arial" w:cs="Arial"/>
-          <w:b/>
-          <w:sz w:val="44"/>
-          <w:szCs w:val="34"/>
-          <w:lang w:val="es-ES"/>
-        </w:rPr>
-        <w:t>Taller 1:</w:t>
+          <w:sz w:val="40"/>
+          <w:szCs w:val="46"/>
+        </w:rPr>
+        <w:t xml:space="preserve">TALLER 1: Fundamentos de </w:t>
       </w:r>
+      <w:proofErr w:type="spellStart"/>
       <w:r>
         <w:rPr>
-          <w:rFonts w:ascii="Arial" w:hAnsi="Arial" w:cs="Arial"/>
-          <w:sz w:val="44"/>
-          <w:szCs w:val="34"/>
-          <w:lang w:val="es-ES"/>
-        </w:rPr>
-        <w:t xml:space="preserve"> Componentes Core y Estilizado </w:t>
+          <w:sz w:val="40"/>
+          <w:szCs w:val="46"/>
+        </w:rPr>
+        <w:t>Unity</w:t>
+      </w:r>
+      <w:proofErr w:type="spellEnd"/>
+      <w:r>
+        <w:rPr>
+          <w:sz w:val="40"/>
+          <w:szCs w:val="46"/>
+        </w:rPr>
+        <w:t xml:space="preserve"> 2D</w:t>
       </w:r>
     </w:p>
     <w:p>
@@ -203,7 +223,7 @@
         <w:rPr>
           <w:rFonts w:cs="Times New Roman"/>
         </w:rPr>
-        <w:t xml:space="preserve">DESARROLLO DE APLICACIONES MOVILES </w:t>
+        <w:t>DESARROLLO DE VIDEOJUEGOS - PERIODO 2026-4 R</w:t>
       </w:r>
     </w:p>
     <w:p>
@@ -213,8 +233,6 @@
           <w:rFonts w:cs="Times New Roman"/>
         </w:rPr>
       </w:pPr>
-      <w:bookmarkStart w:id="0" w:name="_GoBack"/>
-      <w:bookmarkEnd w:id="0"/>
       <w:r>
         <w:rPr>
           <w:rFonts w:cs="Times New Roman"/>
@@ -359,7 +377,7 @@
           <w:sz w:val="32"/>
           <w:szCs w:val="28"/>
         </w:rPr>
-        <w:t>14</w:t>
+        <w:t>30</w:t>
       </w:r>
       <w:r>
         <w:rPr>
@@ -497,32 +515,1127 @@
           <w:color w:val="000000" w:themeColor="text1"/>
           <w:szCs w:val="24"/>
         </w:rPr>
-        <w:t xml:space="preserve">LINK REPOSITORIO: </w:t>
+        <w:t>LINK REPOSITORIO</w:t>
       </w:r>
+      <w:r>
+        <w:rPr>
+          <w:rFonts w:cs="Times New Roman"/>
+          <w:color w:val="000000" w:themeColor="text1"/>
+          <w:szCs w:val="24"/>
+        </w:rPr>
+        <w:t xml:space="preserve"> GITHUB</w:t>
+      </w:r>
+      <w:r>
+        <w:rPr>
+          <w:rFonts w:cs="Times New Roman"/>
+          <w:color w:val="000000" w:themeColor="text1"/>
+          <w:szCs w:val="24"/>
+        </w:rPr>
+        <w:t xml:space="preserve">: </w:t>
+      </w:r>
+    </w:p>
+    <w:p>
       <w:hyperlink r:id="rId8" w:history="1">
         <w:r>
           <w:rPr>
             <w:rStyle w:val="Hipervnculo"/>
-            <w:rFonts w:cs="Times New Roman"/>
-            <w:szCs w:val="24"/>
           </w:rPr>
-          <w:t>https://github.com/MarceloSM123/Taller_1_Componentes_Core_y_Estilizado.git</w:t>
+          <w:t>https://github.com/MarceloSM123/Taller1_Marcelo_Salcedo.git</w:t>
         </w:r>
       </w:hyperlink>
     </w:p>
     <w:p>
-      <w:pPr>
-        <w:jc w:val="both"/>
+      <w:r>
+        <w:t>LINK EVIDENCIAS:</w:t>
+      </w:r>
+    </w:p>
+    <w:p>
+      <w:hyperlink r:id="rId9" w:history="1">
+        <w:r>
+          <w:rPr>
+            <w:rStyle w:val="Hipervnculo"/>
+          </w:rPr>
+          <w:t>https://drive.google.com/drive/folders/1f5D8eHNe9Wf-EqPou6UYN0DttXEwX-1y?usp=sharing</w:t>
+        </w:r>
+      </w:hyperlink>
+    </w:p>
+    <w:p>
+      <w:pPr>
+        <w:rPr>
+          <w:b/>
+          <w:sz w:val="32"/>
+        </w:rPr>
+      </w:pPr>
+      <w:bookmarkStart w:id="0" w:name="_GoBack"/>
+      <w:bookmarkEnd w:id="0"/>
+    </w:p>
+    <w:p>
+      <w:pPr>
+        <w:rPr>
+          <w:b/>
+          <w:sz w:val="32"/>
+        </w:rPr>
+      </w:pPr>
+      <w:r>
+        <w:rPr>
+          <w:b/>
+          <w:sz w:val="32"/>
+        </w:rPr>
+        <w:t>CAPTURAS</w:t>
+      </w:r>
+      <w:r>
+        <w:rPr>
+          <w:b/>
+          <w:sz w:val="32"/>
+        </w:rPr>
+        <w:t>:</w:t>
+      </w:r>
+    </w:p>
+    <w:p>
+      <w:pPr>
+        <w:pStyle w:val="Default"/>
+        <w:rPr>
+          <w:rFonts w:cs="Times New Roman"/>
+          <w:sz w:val="32"/>
+        </w:rPr>
+      </w:pPr>
+      <w:r>
+        <w:rPr>
+          <w:b/>
+          <w:sz w:val="32"/>
+        </w:rPr>
+        <w:t xml:space="preserve">1: </w:t>
+      </w:r>
+      <w:r>
+        <w:rPr>
+          <w:rFonts w:cs="Times New Roman"/>
+          <w:b/>
+          <w:sz w:val="32"/>
+        </w:rPr>
+        <w:t>Proyecto (</w:t>
+      </w:r>
+      <w:proofErr w:type="spellStart"/>
+      <w:r>
+        <w:rPr>
+          <w:rFonts w:cs="Times New Roman"/>
+          <w:b/>
+          <w:sz w:val="32"/>
+        </w:rPr>
+        <w:t>Unity</w:t>
+      </w:r>
+      <w:proofErr w:type="spellEnd"/>
+      <w:r>
+        <w:rPr>
+          <w:rFonts w:cs="Times New Roman"/>
+          <w:b/>
+          <w:sz w:val="32"/>
+        </w:rPr>
+        <w:t xml:space="preserve"> </w:t>
+      </w:r>
+      <w:proofErr w:type="spellStart"/>
+      <w:r>
+        <w:rPr>
+          <w:rFonts w:cs="Times New Roman"/>
+          <w:b/>
+          <w:sz w:val="32"/>
+        </w:rPr>
+        <w:t>Hub</w:t>
+      </w:r>
+      <w:proofErr w:type="spellEnd"/>
+      <w:r>
+        <w:rPr>
+          <w:rFonts w:cs="Times New Roman"/>
+          <w:b/>
+          <w:sz w:val="32"/>
+        </w:rPr>
+        <w:t>)</w:t>
+      </w:r>
+      <w:r>
+        <w:rPr>
+          <w:rFonts w:cs="Times New Roman"/>
+          <w:sz w:val="32"/>
+        </w:rPr>
+        <w:t xml:space="preserve"> </w:t>
+      </w:r>
+    </w:p>
+    <w:p>
+      <w:pPr>
+        <w:pStyle w:val="Default"/>
+        <w:rPr>
+          <w:rFonts w:cs="Times New Roman"/>
+          <w:sz w:val="32"/>
+        </w:rPr>
+      </w:pPr>
+    </w:p>
+    <w:p>
+      <w:pPr>
+        <w:pStyle w:val="Default"/>
+        <w:jc w:val="center"/>
+        <w:rPr>
+          <w:rFonts w:cs="Times New Roman"/>
+          <w:sz w:val="32"/>
+        </w:rPr>
+      </w:pPr>
+      <w:r>
+        <w:rPr>
+          <w:rFonts w:cs="Times New Roman"/>
+          <w:sz w:val="32"/>
+        </w:rPr>
+        <w:pict w14:anchorId="7BBABCCC">
+          <v:shapetype id="_x0000_t75" coordsize="21600,21600" o:spt="75" o:preferrelative="t" path="m@4@5l@4@11@9@11@9@5xe" filled="f" stroked="f">
+            <v:stroke joinstyle="miter"/>
+            <v:formulas>
+              <v:f eqn="if lineDrawn pixelLineWidth 0"/>
+              <v:f eqn="sum @0 1 0"/>
+              <v:f eqn="sum 0 0 @1"/>
+              <v:f eqn="prod @2 1 2"/>
+              <v:f eqn="prod @3 21600 pixelWidth"/>
+              <v:f eqn="prod @3 21600 pixelHeight"/>
+              <v:f eqn="sum @0 0 1"/>
+              <v:f eqn="prod @6 1 2"/>
+              <v:f eqn="prod @7 21600 pixelWidth"/>
+              <v:f eqn="sum @8 21600 0"/>
+              <v:f eqn="prod @7 21600 pixelHeight"/>
+              <v:f eqn="sum @10 21600 0"/>
+            </v:formulas>
+            <v:path o:extrusionok="f" gradientshapeok="t" o:connecttype="rect"/>
+            <o:lock v:ext="edit" aspectratio="t"/>
+          </v:shapetype>
+          <v:shape id="_x0000_i1025" type="#_x0000_t75" style="width:431.4pt;height:148.8pt">
+            <v:imagedata r:id="rId10" o:title="Proyecto_Unity_Hub"/>
+          </v:shape>
+        </w:pict>
+      </w:r>
+    </w:p>
+    <w:p>
+      <w:pPr>
+        <w:pStyle w:val="Default"/>
+        <w:jc w:val="center"/>
+        <w:rPr>
+          <w:rFonts w:cs="Times New Roman"/>
+          <w:sz w:val="32"/>
+        </w:rPr>
+      </w:pPr>
+    </w:p>
+    <w:p>
+      <w:pPr>
+        <w:pStyle w:val="Default"/>
+        <w:jc w:val="center"/>
+        <w:rPr>
+          <w:rFonts w:cs="Times New Roman"/>
+          <w:sz w:val="32"/>
+        </w:rPr>
+      </w:pPr>
+    </w:p>
+    <w:p>
+      <w:pPr>
+        <w:pStyle w:val="Default"/>
+        <w:rPr>
+          <w:rFonts w:cs="Times New Roman"/>
+          <w:sz w:val="32"/>
+        </w:rPr>
+      </w:pPr>
+    </w:p>
+    <w:p>
+      <w:pPr>
+        <w:pStyle w:val="Default"/>
+        <w:rPr>
+          <w:rFonts w:cs="Times New Roman"/>
+          <w:sz w:val="32"/>
+        </w:rPr>
+      </w:pPr>
+      <w:r>
+        <w:rPr>
+          <w:rFonts w:cs="Times New Roman"/>
+          <w:sz w:val="32"/>
+        </w:rPr>
+        <w:t xml:space="preserve">Interfaz de </w:t>
+      </w:r>
+      <w:proofErr w:type="spellStart"/>
+      <w:r>
+        <w:rPr>
+          <w:rFonts w:cs="Times New Roman"/>
+          <w:sz w:val="32"/>
+        </w:rPr>
+        <w:t>unity</w:t>
+      </w:r>
+      <w:proofErr w:type="spellEnd"/>
+      <w:r>
+        <w:rPr>
+          <w:rFonts w:cs="Times New Roman"/>
+          <w:sz w:val="32"/>
+        </w:rPr>
+        <w:t xml:space="preserve"> mostrando el panel de control “Proyectos”, que contiene el proyecto “Taller_1_Marcelo_Salcedo”. </w:t>
+      </w:r>
+    </w:p>
+    <w:p>
+      <w:pPr>
+        <w:pStyle w:val="Default"/>
+        <w:rPr>
+          <w:rFonts w:cs="Times New Roman"/>
+          <w:sz w:val="32"/>
+        </w:rPr>
+      </w:pPr>
+    </w:p>
+    <w:p>
+      <w:pPr>
+        <w:pStyle w:val="Default"/>
+        <w:rPr>
+          <w:rFonts w:cs="Times New Roman"/>
+          <w:sz w:val="32"/>
+        </w:rPr>
+      </w:pPr>
+    </w:p>
+    <w:p>
+      <w:pPr>
+        <w:pStyle w:val="Default"/>
+        <w:rPr>
+          <w:rFonts w:cs="Times New Roman"/>
+          <w:sz w:val="32"/>
+        </w:rPr>
+      </w:pPr>
+    </w:p>
+    <w:p>
+      <w:pPr>
+        <w:pStyle w:val="Default"/>
+        <w:rPr>
+          <w:rFonts w:cs="Times New Roman"/>
+          <w:sz w:val="32"/>
+        </w:rPr>
+      </w:pPr>
+    </w:p>
+    <w:p>
+      <w:pPr>
+        <w:pStyle w:val="Default"/>
+        <w:rPr>
+          <w:rFonts w:cs="Times New Roman"/>
+          <w:sz w:val="32"/>
+        </w:rPr>
+      </w:pPr>
+    </w:p>
+    <w:p>
+      <w:pPr>
+        <w:pStyle w:val="Default"/>
+        <w:rPr>
+          <w:rFonts w:cs="Times New Roman"/>
+          <w:sz w:val="32"/>
+        </w:rPr>
+      </w:pPr>
+    </w:p>
+    <w:p>
+      <w:pPr>
+        <w:pStyle w:val="Default"/>
+        <w:rPr>
+          <w:rFonts w:cs="Times New Roman"/>
+          <w:sz w:val="32"/>
+        </w:rPr>
+      </w:pPr>
+    </w:p>
+    <w:p>
+      <w:pPr>
+        <w:pStyle w:val="Default"/>
+        <w:rPr>
+          <w:rFonts w:cs="Times New Roman"/>
+          <w:sz w:val="32"/>
+        </w:rPr>
+      </w:pPr>
+    </w:p>
+    <w:p>
+      <w:pPr>
+        <w:pStyle w:val="Default"/>
+        <w:rPr>
+          <w:rFonts w:cs="Times New Roman"/>
+          <w:sz w:val="32"/>
+        </w:rPr>
+      </w:pPr>
+    </w:p>
+    <w:p>
+      <w:pPr>
+        <w:pStyle w:val="Default"/>
+        <w:rPr>
+          <w:rFonts w:cs="Times New Roman"/>
+          <w:sz w:val="32"/>
+        </w:rPr>
+      </w:pPr>
+    </w:p>
+    <w:p>
+      <w:pPr>
+        <w:pStyle w:val="Default"/>
+        <w:rPr>
+          <w:rFonts w:cs="Times New Roman"/>
+          <w:sz w:val="32"/>
+        </w:rPr>
+      </w:pPr>
+    </w:p>
+    <w:p>
+      <w:pPr>
+        <w:pStyle w:val="Default"/>
+        <w:rPr>
+          <w:rFonts w:cs="Times New Roman"/>
+          <w:sz w:val="32"/>
+        </w:rPr>
+      </w:pPr>
+    </w:p>
+    <w:p>
+      <w:pPr>
+        <w:pStyle w:val="Default"/>
+        <w:rPr>
+          <w:rFonts w:cs="Times New Roman"/>
+          <w:sz w:val="32"/>
+        </w:rPr>
+      </w:pPr>
+    </w:p>
+    <w:p>
+      <w:pPr>
+        <w:pStyle w:val="Default"/>
+        <w:rPr>
+          <w:rFonts w:cs="Times New Roman"/>
+          <w:b/>
+          <w:sz w:val="32"/>
+        </w:rPr>
+      </w:pPr>
+      <w:r>
+        <w:rPr>
+          <w:rFonts w:cs="Times New Roman"/>
+          <w:b/>
+          <w:sz w:val="32"/>
+        </w:rPr>
+        <w:t>2:</w:t>
+      </w:r>
+      <w:r>
+        <w:rPr>
+          <w:b/>
+        </w:rPr>
+        <w:t xml:space="preserve"> </w:t>
+      </w:r>
+      <w:proofErr w:type="spellStart"/>
+      <w:r>
+        <w:rPr>
+          <w:rFonts w:cs="Times New Roman"/>
+          <w:b/>
+          <w:sz w:val="32"/>
+        </w:rPr>
+        <w:t>Assets</w:t>
+      </w:r>
+      <w:proofErr w:type="spellEnd"/>
+      <w:r>
+        <w:rPr>
+          <w:rFonts w:cs="Times New Roman"/>
+          <w:b/>
+          <w:sz w:val="32"/>
+        </w:rPr>
+        <w:t xml:space="preserve"> (Organización de Recursos) </w:t>
+      </w:r>
+    </w:p>
+    <w:p>
+      <w:pPr>
+        <w:pStyle w:val="Default"/>
+        <w:rPr>
+          <w:rFonts w:cs="Times New Roman"/>
+          <w:b/>
+          <w:sz w:val="32"/>
+        </w:rPr>
+      </w:pPr>
+    </w:p>
+    <w:p>
+      <w:pPr>
+        <w:pStyle w:val="Default"/>
+        <w:jc w:val="center"/>
+        <w:rPr>
+          <w:rFonts w:cs="Times New Roman"/>
+          <w:b/>
+          <w:sz w:val="32"/>
+        </w:rPr>
+      </w:pPr>
+      <w:r>
+        <w:rPr>
+          <w:rFonts w:cs="Times New Roman"/>
+          <w:b/>
+          <w:sz w:val="32"/>
+        </w:rPr>
+        <w:pict w14:anchorId="478C8DCC">
+          <v:shape id="_x0000_i1026" type="#_x0000_t75" style="width:388.8pt;height:237.6pt">
+            <v:imagedata r:id="rId11" o:title="Assets_organizacion"/>
+          </v:shape>
+        </w:pict>
+      </w:r>
+    </w:p>
+    <w:p>
+      <w:pPr>
+        <w:pStyle w:val="Default"/>
+        <w:jc w:val="center"/>
+        <w:rPr>
+          <w:rFonts w:cs="Times New Roman"/>
+          <w:b/>
+          <w:sz w:val="32"/>
+        </w:rPr>
+      </w:pPr>
+    </w:p>
+    <w:p>
+      <w:pPr>
+        <w:pStyle w:val="Default"/>
+        <w:rPr>
+          <w:rFonts w:cs="Times New Roman"/>
+          <w:sz w:val="32"/>
+        </w:rPr>
+      </w:pPr>
+      <w:r>
+        <w:rPr>
+          <w:rFonts w:cs="Times New Roman"/>
+          <w:sz w:val="32"/>
+        </w:rPr>
+        <w:t xml:space="preserve">Panel </w:t>
+      </w:r>
+      <w:proofErr w:type="spellStart"/>
+      <w:r>
+        <w:rPr>
+          <w:rFonts w:cs="Times New Roman"/>
+          <w:sz w:val="32"/>
+        </w:rPr>
+        <w:t>proyect</w:t>
+      </w:r>
+      <w:proofErr w:type="spellEnd"/>
+      <w:r>
+        <w:rPr>
+          <w:rFonts w:cs="Times New Roman"/>
+          <w:sz w:val="32"/>
+        </w:rPr>
+        <w:t xml:space="preserve">, dentro del editor de </w:t>
+      </w:r>
+      <w:proofErr w:type="spellStart"/>
+      <w:r>
+        <w:rPr>
+          <w:rFonts w:cs="Times New Roman"/>
+          <w:sz w:val="32"/>
+        </w:rPr>
+        <w:t>unity</w:t>
+      </w:r>
+      <w:proofErr w:type="spellEnd"/>
+      <w:r>
+        <w:rPr>
+          <w:rFonts w:cs="Times New Roman"/>
+          <w:sz w:val="32"/>
+        </w:rPr>
+        <w:t xml:space="preserve">, muestra la ruta de navegación </w:t>
+      </w:r>
+      <w:proofErr w:type="spellStart"/>
+      <w:r>
+        <w:rPr>
+          <w:rFonts w:cs="Times New Roman"/>
+          <w:sz w:val="32"/>
+        </w:rPr>
+        <w:t>assets</w:t>
+      </w:r>
+      <w:proofErr w:type="spellEnd"/>
+      <w:r>
+        <w:rPr>
+          <w:rFonts w:cs="Times New Roman"/>
+          <w:sz w:val="32"/>
+        </w:rPr>
+        <w:t>/</w:t>
+      </w:r>
+      <w:proofErr w:type="spellStart"/>
+      <w:r>
+        <w:rPr>
+          <w:rFonts w:cs="Times New Roman"/>
+          <w:sz w:val="32"/>
+        </w:rPr>
+        <w:t>sprites</w:t>
+      </w:r>
+      <w:proofErr w:type="spellEnd"/>
+      <w:r>
+        <w:rPr>
+          <w:rFonts w:cs="Times New Roman"/>
+          <w:sz w:val="32"/>
+        </w:rPr>
+        <w:t xml:space="preserve"> y los respectivos </w:t>
+      </w:r>
+      <w:proofErr w:type="spellStart"/>
+      <w:r>
+        <w:rPr>
+          <w:rFonts w:cs="Times New Roman"/>
+          <w:sz w:val="32"/>
+        </w:rPr>
+        <w:t>sprites</w:t>
+      </w:r>
+      <w:proofErr w:type="spellEnd"/>
+      <w:r>
+        <w:rPr>
+          <w:rFonts w:cs="Times New Roman"/>
+          <w:sz w:val="32"/>
+        </w:rPr>
+        <w:t xml:space="preserve"> que contiene.</w:t>
+      </w:r>
+    </w:p>
+    <w:p>
+      <w:pPr>
+        <w:pStyle w:val="Default"/>
+        <w:rPr>
+          <w:rFonts w:cs="Times New Roman"/>
+          <w:sz w:val="32"/>
+        </w:rPr>
+      </w:pPr>
+    </w:p>
+    <w:p>
+      <w:pPr>
+        <w:pStyle w:val="Default"/>
+        <w:rPr>
+          <w:rFonts w:cs="Times New Roman"/>
+          <w:sz w:val="32"/>
+        </w:rPr>
+      </w:pPr>
+    </w:p>
+    <w:p>
+      <w:pPr>
+        <w:pStyle w:val="Default"/>
+        <w:rPr>
+          <w:rFonts w:cs="Times New Roman"/>
+          <w:sz w:val="32"/>
+        </w:rPr>
+      </w:pPr>
+    </w:p>
+    <w:p>
+      <w:pPr>
+        <w:pStyle w:val="Default"/>
+        <w:rPr>
+          <w:rFonts w:cs="Times New Roman"/>
+          <w:sz w:val="32"/>
+        </w:rPr>
+      </w:pPr>
+    </w:p>
+    <w:p>
+      <w:pPr>
+        <w:pStyle w:val="Default"/>
+        <w:rPr>
+          <w:rFonts w:cs="Times New Roman"/>
+          <w:sz w:val="32"/>
+        </w:rPr>
+      </w:pPr>
+    </w:p>
+    <w:p>
+      <w:pPr>
+        <w:pStyle w:val="Default"/>
+        <w:rPr>
+          <w:rFonts w:cs="Times New Roman"/>
+          <w:sz w:val="32"/>
+        </w:rPr>
+      </w:pPr>
+    </w:p>
+    <w:p>
+      <w:pPr>
+        <w:pStyle w:val="Default"/>
+        <w:rPr>
+          <w:rFonts w:cs="Times New Roman"/>
+          <w:sz w:val="32"/>
+        </w:rPr>
+      </w:pPr>
+    </w:p>
+    <w:p>
+      <w:pPr>
+        <w:pStyle w:val="Default"/>
+        <w:rPr>
+          <w:rFonts w:cs="Times New Roman"/>
+          <w:sz w:val="32"/>
+        </w:rPr>
+      </w:pPr>
+    </w:p>
+    <w:p>
+      <w:pPr>
+        <w:pStyle w:val="Default"/>
+        <w:rPr>
+          <w:rFonts w:cs="Times New Roman"/>
+          <w:sz w:val="32"/>
+        </w:rPr>
+      </w:pPr>
+    </w:p>
+    <w:p>
+      <w:pPr>
+        <w:pStyle w:val="Default"/>
+        <w:rPr>
+          <w:rFonts w:cs="Times New Roman"/>
+          <w:sz w:val="32"/>
+        </w:rPr>
+      </w:pPr>
+    </w:p>
+    <w:p>
+      <w:pPr>
+        <w:pStyle w:val="Default"/>
+        <w:rPr>
+          <w:rFonts w:cs="Times New Roman"/>
+          <w:sz w:val="32"/>
+        </w:rPr>
+      </w:pPr>
+    </w:p>
+    <w:p>
+      <w:pPr>
+        <w:pStyle w:val="Default"/>
+        <w:rPr>
+          <w:rFonts w:cs="Times New Roman"/>
+          <w:sz w:val="32"/>
+        </w:rPr>
+      </w:pPr>
+    </w:p>
+    <w:p>
+      <w:pPr>
+        <w:pStyle w:val="Default"/>
+        <w:rPr>
+          <w:rFonts w:cs="Times New Roman"/>
+          <w:b/>
+          <w:sz w:val="32"/>
+        </w:rPr>
+      </w:pPr>
+    </w:p>
+    <w:p>
+      <w:pPr>
+        <w:pStyle w:val="Default"/>
+        <w:rPr>
+          <w:rFonts w:cs="Times New Roman"/>
+          <w:b/>
+          <w:sz w:val="32"/>
+        </w:rPr>
+      </w:pPr>
+    </w:p>
+    <w:p>
+      <w:pPr>
+        <w:pStyle w:val="Default"/>
+        <w:rPr>
+          <w:rFonts w:cs="Times New Roman"/>
+          <w:sz w:val="32"/>
+        </w:rPr>
+      </w:pPr>
+      <w:r>
+        <w:rPr>
+          <w:rFonts w:cs="Times New Roman"/>
+          <w:b/>
+          <w:sz w:val="32"/>
+        </w:rPr>
+        <w:t>3:</w:t>
+      </w:r>
+      <w:r>
+        <w:t xml:space="preserve"> </w:t>
+      </w:r>
+      <w:r>
+        <w:rPr>
+          <w:rFonts w:cs="Times New Roman"/>
+          <w:b/>
+          <w:sz w:val="32"/>
+        </w:rPr>
+        <w:t>Escena (Configuración de Objetos)</w:t>
+      </w:r>
+      <w:r>
+        <w:rPr>
+          <w:rFonts w:cs="Times New Roman"/>
+          <w:sz w:val="32"/>
+        </w:rPr>
+        <w:t xml:space="preserve"> </w:t>
+      </w:r>
+    </w:p>
+    <w:p>
+      <w:pPr>
+        <w:pStyle w:val="Default"/>
+        <w:rPr>
+          <w:rFonts w:cs="Times New Roman"/>
+          <w:sz w:val="32"/>
+        </w:rPr>
+      </w:pPr>
+    </w:p>
+    <w:p>
+      <w:pPr>
+        <w:pStyle w:val="Default"/>
+        <w:jc w:val="center"/>
+        <w:rPr>
+          <w:rFonts w:cs="Times New Roman"/>
+          <w:sz w:val="32"/>
+        </w:rPr>
+      </w:pPr>
+      <w:r>
+        <w:rPr>
+          <w:rFonts w:cs="Times New Roman"/>
+          <w:sz w:val="32"/>
+        </w:rPr>
+        <w:pict w14:anchorId="029C2FC7">
+          <v:shape id="_x0000_i1027" type="#_x0000_t75" style="width:431.4pt;height:161.4pt">
+            <v:imagedata r:id="rId12" o:title="Escena_objetos"/>
+          </v:shape>
+        </w:pict>
+      </w:r>
+    </w:p>
+    <w:p>
+      <w:pPr>
+        <w:pStyle w:val="Default"/>
+        <w:rPr>
+          <w:rFonts w:cs="Times New Roman"/>
+          <w:sz w:val="32"/>
+        </w:rPr>
+      </w:pPr>
+    </w:p>
+    <w:p>
+      <w:pPr>
+        <w:pStyle w:val="Default"/>
+        <w:rPr>
+          <w:rFonts w:cs="Times New Roman"/>
+          <w:sz w:val="32"/>
+        </w:rPr>
+      </w:pPr>
+    </w:p>
+    <w:p>
+      <w:pPr>
+        <w:pStyle w:val="Default"/>
+        <w:rPr>
+          <w:rFonts w:cs="Times New Roman"/>
+          <w:sz w:val="32"/>
+        </w:rPr>
+      </w:pPr>
+      <w:r>
+        <w:rPr>
+          <w:rFonts w:cs="Times New Roman"/>
+          <w:sz w:val="32"/>
+        </w:rPr>
+        <w:t xml:space="preserve">Panel de </w:t>
+      </w:r>
+      <w:proofErr w:type="spellStart"/>
+      <w:r>
+        <w:rPr>
+          <w:rFonts w:cs="Times New Roman"/>
+          <w:sz w:val="32"/>
+        </w:rPr>
+        <w:t>Hierachy</w:t>
+      </w:r>
+      <w:proofErr w:type="spellEnd"/>
+      <w:r>
+        <w:rPr>
+          <w:rFonts w:cs="Times New Roman"/>
+          <w:sz w:val="32"/>
+        </w:rPr>
+        <w:t xml:space="preserve">, mostrando los objetos </w:t>
+      </w:r>
+      <w:proofErr w:type="spellStart"/>
+      <w:r>
+        <w:rPr>
+          <w:rFonts w:cs="Times New Roman"/>
+          <w:sz w:val="32"/>
+        </w:rPr>
+        <w:t>player</w:t>
+      </w:r>
+      <w:proofErr w:type="spellEnd"/>
+      <w:r>
+        <w:rPr>
+          <w:rFonts w:cs="Times New Roman"/>
+          <w:sz w:val="32"/>
+        </w:rPr>
+        <w:t xml:space="preserve"> y </w:t>
+      </w:r>
+      <w:proofErr w:type="spellStart"/>
+      <w:r>
+        <w:rPr>
+          <w:rFonts w:cs="Times New Roman"/>
+          <w:sz w:val="32"/>
+        </w:rPr>
+        <w:t>Plataform</w:t>
+      </w:r>
+      <w:proofErr w:type="spellEnd"/>
+      <w:r>
+        <w:rPr>
+          <w:rFonts w:cs="Times New Roman"/>
+          <w:sz w:val="32"/>
+        </w:rPr>
+        <w:t xml:space="preserve">, en el panel escenario se muestran los al objeto </w:t>
+      </w:r>
+      <w:proofErr w:type="spellStart"/>
+      <w:r>
+        <w:rPr>
+          <w:rFonts w:cs="Times New Roman"/>
+          <w:sz w:val="32"/>
+        </w:rPr>
+        <w:t>player</w:t>
+      </w:r>
+      <w:proofErr w:type="spellEnd"/>
+      <w:r>
+        <w:rPr>
+          <w:rFonts w:cs="Times New Roman"/>
+          <w:sz w:val="32"/>
+        </w:rPr>
+        <w:t xml:space="preserve"> justo sobre el objeto </w:t>
+      </w:r>
+      <w:proofErr w:type="spellStart"/>
+      <w:r>
+        <w:rPr>
+          <w:rFonts w:cs="Times New Roman"/>
+          <w:sz w:val="32"/>
+        </w:rPr>
+        <w:t>plataform</w:t>
+      </w:r>
+      <w:proofErr w:type="spellEnd"/>
+      <w:r>
+        <w:rPr>
+          <w:rFonts w:cs="Times New Roman"/>
+          <w:sz w:val="32"/>
+        </w:rPr>
+        <w:t>.</w:t>
+      </w:r>
+    </w:p>
+    <w:p>
+      <w:pPr>
+        <w:pStyle w:val="Default"/>
+        <w:rPr>
+          <w:rFonts w:cs="Times New Roman"/>
+          <w:sz w:val="32"/>
+        </w:rPr>
+      </w:pPr>
+    </w:p>
+    <w:p>
+      <w:pPr>
+        <w:pStyle w:val="Default"/>
+        <w:rPr>
+          <w:rFonts w:cs="Times New Roman"/>
+          <w:sz w:val="32"/>
+        </w:rPr>
+      </w:pPr>
+    </w:p>
+    <w:p>
+      <w:pPr>
+        <w:pStyle w:val="Default"/>
+        <w:rPr>
+          <w:rFonts w:cs="Times New Roman"/>
+          <w:sz w:val="32"/>
+        </w:rPr>
+      </w:pPr>
+    </w:p>
+    <w:p>
+      <w:pPr>
+        <w:pStyle w:val="Default"/>
+        <w:rPr>
+          <w:rFonts w:cs="Times New Roman"/>
+          <w:sz w:val="32"/>
+        </w:rPr>
+      </w:pPr>
+    </w:p>
+    <w:p>
+      <w:pPr>
+        <w:pStyle w:val="Default"/>
+        <w:rPr>
+          <w:rFonts w:cs="Times New Roman"/>
+          <w:sz w:val="32"/>
+        </w:rPr>
+      </w:pPr>
+    </w:p>
+    <w:p>
+      <w:pPr>
+        <w:pStyle w:val="Default"/>
+        <w:rPr>
+          <w:rFonts w:cs="Times New Roman"/>
+          <w:sz w:val="32"/>
+        </w:rPr>
+      </w:pPr>
+    </w:p>
+    <w:p>
+      <w:pPr>
+        <w:pStyle w:val="Default"/>
+        <w:rPr>
+          <w:rFonts w:cs="Times New Roman"/>
+          <w:sz w:val="32"/>
+        </w:rPr>
+      </w:pPr>
+    </w:p>
+    <w:p>
+      <w:pPr>
+        <w:pStyle w:val="Default"/>
+        <w:rPr>
+          <w:rFonts w:cs="Times New Roman"/>
+          <w:sz w:val="32"/>
+        </w:rPr>
+      </w:pPr>
+    </w:p>
+    <w:p>
+      <w:pPr>
+        <w:pStyle w:val="Default"/>
+        <w:rPr>
+          <w:rFonts w:cs="Times New Roman"/>
+          <w:sz w:val="32"/>
+        </w:rPr>
+      </w:pPr>
+    </w:p>
+    <w:p>
+      <w:pPr>
+        <w:pStyle w:val="Default"/>
+        <w:rPr>
+          <w:rFonts w:cs="Times New Roman"/>
+          <w:sz w:val="32"/>
+        </w:rPr>
+      </w:pPr>
+    </w:p>
+    <w:p>
+      <w:pPr>
+        <w:pStyle w:val="Default"/>
+        <w:rPr>
+          <w:rFonts w:cs="Times New Roman"/>
+          <w:sz w:val="32"/>
+        </w:rPr>
+      </w:pPr>
+    </w:p>
+    <w:p>
+      <w:pPr>
+        <w:pStyle w:val="Default"/>
+        <w:rPr>
+          <w:rFonts w:cs="Times New Roman"/>
+          <w:sz w:val="32"/>
+        </w:rPr>
+      </w:pPr>
+    </w:p>
+    <w:p>
+      <w:pPr>
+        <w:pStyle w:val="Default"/>
+        <w:rPr>
+          <w:rFonts w:cs="Times New Roman"/>
+          <w:sz w:val="32"/>
+        </w:rPr>
+      </w:pPr>
+    </w:p>
+    <w:p>
+      <w:pPr>
+        <w:pStyle w:val="Default"/>
+        <w:rPr>
+          <w:rFonts w:cs="Times New Roman"/>
+          <w:sz w:val="32"/>
+        </w:rPr>
+      </w:pPr>
+    </w:p>
+    <w:p>
+      <w:pPr>
+        <w:pStyle w:val="Default"/>
+        <w:rPr>
+          <w:rFonts w:cs="Times New Roman"/>
+          <w:sz w:val="32"/>
+        </w:rPr>
+      </w:pPr>
+    </w:p>
+    <w:p>
+      <w:pPr>
+        <w:pStyle w:val="Default"/>
+        <w:rPr>
+          <w:rFonts w:cs="Times New Roman"/>
+          <w:sz w:val="32"/>
+        </w:rPr>
+      </w:pPr>
+    </w:p>
+    <w:p>
+      <w:pPr>
+        <w:pStyle w:val="Default"/>
+        <w:rPr>
+          <w:rFonts w:cs="Times New Roman"/>
+          <w:sz w:val="32"/>
+        </w:rPr>
+      </w:pPr>
+    </w:p>
+    <w:p>
+      <w:pPr>
+        <w:pStyle w:val="Default"/>
+        <w:rPr>
+          <w:rFonts w:cs="Times New Roman"/>
+          <w:sz w:val="32"/>
+        </w:rPr>
+      </w:pPr>
+    </w:p>
+    <w:p>
+      <w:pPr>
+        <w:pStyle w:val="Default"/>
+        <w:rPr>
+          <w:rFonts w:cs="Times New Roman"/>
+          <w:sz w:val="32"/>
+        </w:rPr>
+      </w:pPr>
+    </w:p>
+    <w:p>
+      <w:pPr>
+        <w:pStyle w:val="Default"/>
+        <w:rPr>
+          <w:rFonts w:cs="Times New Roman"/>
+          <w:sz w:val="32"/>
+        </w:rPr>
+      </w:pPr>
+    </w:p>
+    <w:p>
+      <w:pPr>
+        <w:pStyle w:val="Default"/>
+        <w:rPr>
+          <w:rFonts w:cs="Times New Roman"/>
+          <w:sz w:val="32"/>
+        </w:rPr>
+      </w:pPr>
+    </w:p>
+    <w:p>
+      <w:pPr>
+        <w:pStyle w:val="Default"/>
+        <w:rPr>
+          <w:rFonts w:cs="Times New Roman"/>
+          <w:b/>
+          <w:sz w:val="32"/>
+          <w:szCs w:val="32"/>
+        </w:rPr>
+      </w:pPr>
+      <w:r>
+        <w:rPr>
+          <w:rFonts w:cs="Times New Roman"/>
+          <w:b/>
+          <w:sz w:val="32"/>
+          <w:szCs w:val="32"/>
+        </w:rPr>
+        <w:t>4:</w:t>
+      </w:r>
+      <w:r>
+        <w:rPr>
+          <w:b/>
+          <w:sz w:val="32"/>
+          <w:szCs w:val="32"/>
+        </w:rPr>
+        <w:t xml:space="preserve"> </w:t>
+      </w:r>
+      <w:r>
+        <w:rPr>
+          <w:rFonts w:cs="Times New Roman"/>
+          <w:b/>
+          <w:sz w:val="32"/>
+          <w:szCs w:val="32"/>
+        </w:rPr>
+        <w:t xml:space="preserve">Play (Verificación de Físicas) </w:t>
+      </w:r>
+    </w:p>
+    <w:p>
+      <w:pPr>
+        <w:pStyle w:val="Default"/>
+        <w:rPr>
+          <w:rFonts w:ascii="Times New Roman" w:hAnsi="Times New Roman" w:cs="Times New Roman"/>
+          <w:b/>
+          <w:sz w:val="32"/>
+          <w:szCs w:val="32"/>
+        </w:rPr>
+      </w:pPr>
+    </w:p>
+    <w:p>
+      <w:pPr>
+        <w:jc w:val="center"/>
         <w:rPr>
           <w:rFonts w:cs="Times New Roman"/>
           <w:color w:val="000000" w:themeColor="text1"/>
           <w:szCs w:val="24"/>
         </w:rPr>
       </w:pPr>
+      <w:r>
+        <w:rPr>
+          <w:rFonts w:cs="Times New Roman"/>
+          <w:color w:val="000000" w:themeColor="text1"/>
+          <w:szCs w:val="24"/>
+        </w:rPr>
+        <w:pict w14:anchorId="1B584319">
+          <v:shape id="_x0000_i1028" type="#_x0000_t75" style="width:6in;height:225.6pt">
+            <v:imagedata r:id="rId13" o:title="Play_verificacion"/>
+          </v:shape>
+        </w:pict>
+      </w:r>
     </w:p>
     <w:p>
       <w:pPr>
-        <w:jc w:val="both"/>
+        <w:jc w:val="center"/>
         <w:rPr>
           <w:rFonts w:cs="Times New Roman"/>
           <w:color w:val="000000" w:themeColor="text1"/>
@@ -530,8 +1643,126 @@
         </w:rPr>
       </w:pPr>
     </w:p>
+    <w:p>
+      <w:pPr>
+        <w:rPr>
+          <w:rFonts w:cs="Times New Roman"/>
+          <w:color w:val="000000" w:themeColor="text1"/>
+          <w:sz w:val="32"/>
+          <w:szCs w:val="24"/>
+        </w:rPr>
+      </w:pPr>
+      <w:r>
+        <w:rPr>
+          <w:rFonts w:cs="Times New Roman"/>
+          <w:color w:val="000000" w:themeColor="text1"/>
+          <w:sz w:val="32"/>
+          <w:szCs w:val="24"/>
+        </w:rPr>
+        <w:t xml:space="preserve">El juego </w:t>
+      </w:r>
+      <w:proofErr w:type="spellStart"/>
+      <w:r>
+        <w:rPr>
+          <w:rFonts w:cs="Times New Roman"/>
+          <w:color w:val="000000" w:themeColor="text1"/>
+          <w:sz w:val="32"/>
+          <w:szCs w:val="24"/>
+        </w:rPr>
+        <w:t>esta</w:t>
+      </w:r>
+      <w:proofErr w:type="spellEnd"/>
+      <w:r>
+        <w:rPr>
+          <w:rFonts w:cs="Times New Roman"/>
+          <w:color w:val="000000" w:themeColor="text1"/>
+          <w:sz w:val="32"/>
+          <w:szCs w:val="24"/>
+        </w:rPr>
+        <w:t xml:space="preserve"> </w:t>
+      </w:r>
+      <w:r>
+        <w:rPr>
+          <w:rFonts w:cs="Times New Roman"/>
+          <w:color w:val="000000" w:themeColor="text1"/>
+          <w:sz w:val="32"/>
+          <w:szCs w:val="24"/>
+        </w:rPr>
+        <w:t xml:space="preserve">corriendo es decir con el </w:t>
+      </w:r>
+      <w:proofErr w:type="spellStart"/>
+      <w:r>
+        <w:rPr>
+          <w:rFonts w:cs="Times New Roman"/>
+          <w:color w:val="000000" w:themeColor="text1"/>
+          <w:sz w:val="32"/>
+          <w:szCs w:val="24"/>
+        </w:rPr>
+        <w:t>play</w:t>
+      </w:r>
+      <w:proofErr w:type="spellEnd"/>
+      <w:r>
+        <w:rPr>
+          <w:rFonts w:cs="Times New Roman"/>
+          <w:color w:val="000000" w:themeColor="text1"/>
+          <w:sz w:val="32"/>
+          <w:szCs w:val="24"/>
+        </w:rPr>
+        <w:t xml:space="preserve"> activo, el personaje se mantiene sobre la plataforma gracias a las configuraciones </w:t>
+      </w:r>
+      <w:proofErr w:type="spellStart"/>
+      <w:r>
+        <w:rPr>
+          <w:rFonts w:cs="Times New Roman"/>
+          <w:color w:val="000000" w:themeColor="text1"/>
+          <w:sz w:val="32"/>
+          <w:szCs w:val="24"/>
+        </w:rPr>
+        <w:t>rigidBody</w:t>
+      </w:r>
+      <w:proofErr w:type="spellEnd"/>
+      <w:r>
+        <w:rPr>
+          <w:rFonts w:cs="Times New Roman"/>
+          <w:color w:val="000000" w:themeColor="text1"/>
+          <w:sz w:val="32"/>
+          <w:szCs w:val="24"/>
+        </w:rPr>
+        <w:t xml:space="preserve"> y box </w:t>
+      </w:r>
+      <w:proofErr w:type="spellStart"/>
+      <w:r>
+        <w:rPr>
+          <w:rFonts w:cs="Times New Roman"/>
+          <w:color w:val="000000" w:themeColor="text1"/>
+          <w:sz w:val="32"/>
+          <w:szCs w:val="24"/>
+        </w:rPr>
+        <w:t>Colider</w:t>
+      </w:r>
+      <w:proofErr w:type="spellEnd"/>
+      <w:r>
+        <w:rPr>
+          <w:rFonts w:cs="Times New Roman"/>
+          <w:color w:val="000000" w:themeColor="text1"/>
+          <w:sz w:val="32"/>
+          <w:szCs w:val="24"/>
+        </w:rPr>
+        <w:t xml:space="preserve"> 2D.</w:t>
+      </w:r>
+    </w:p>
+    <w:p>
+      <w:pPr>
+        <w:jc w:val="both"/>
+        <w:rPr>
+          <w:rFonts w:cs="Times New Roman"/>
+          <w:color w:val="000000" w:themeColor="text1"/>
+          <w:szCs w:val="24"/>
+        </w:rPr>
+      </w:pPr>
+    </w:p>
     <w:sectPr>
-      <w:headerReference w:type="default" r:id="rId9"/>
+      <w:headerReference w:type="default" r:id="rId14"/>
       <w:pgSz w:w="12240" w:h="15840"/>
       <w:pgMar w:top="1440" w:right="1797" w:bottom="1134" w:left="1797" w:header="340" w:footer="0" w:gutter="0"/>
       <w:cols w:space="720"/>
@@ -12956,7 +14187,7 @@
 </file>
 
 <file path=customXml/itemProps1.xml><?xml version="1.0" encoding="utf-8"?>
-<ds:datastoreItem xmlns:ds="http://schemas.openxmlformats.org/officeDocument/2006/customXml" ds:itemID="{5AFD6D27-43A2-4F07-BA45-2E5BE4E22436}">
+<ds:datastoreItem xmlns:ds="http://schemas.openxmlformats.org/officeDocument/2006/customXml" ds:itemID="{8765AF67-CD6A-483F-8E22-A368E22EA278}">
   <ds:schemaRefs>
     <ds:schemaRef ds:uri="http://schemas.openxmlformats.org/officeDocument/2006/bibliography"/>
   </ds:schemaRefs>

</xml_diff>